<commit_message>
Vorschau statt Auto-Download, Archiv der Schreiben, Listen ohne seitliches Scrollen
- Briefe erscheinen zuerst in einer Vorschau (Drucken/PDF, Per E-Mail, Herunterladen,
  Datei in die E-Mail ziehen); erst dann wird das Schreiben im Verlauf archiviert
- Erstellte Schreiben im privaten Bucket "schreiben", in Übersicht und Akte als Kacheln ansehbar
- Mieterliste, Handlungsbedarf, offene und bezahlte Posten als responsive Listen (ab 360 px)
- Vorlagen mit Beispieldaten ansehen; Platzhalterliste aus der App in PLATZHALTER.md verschoben
- Briefkopf der Vorlagen als Tabelle (gleiche Darstellung in Word und Vorschau)

Co-Authored-By: Claude Opus 5.5 <noreply@anthropic.com>
Claude-Session: https://claude.ai/code/session_01JqL1C2ropmmApKDHURmYSd
</commit_message>
<xml_diff>
--- a/vorlagen/mahnung_1.docx
+++ b/vorlagen/mahnung_1.docx
@@ -1031,64 +1031,147 @@
 
 <file path=word/header1.xml><?xml version="1.0" encoding="utf-8"?>
 <w:hdr xmlns:wpc="http://schemas.microsoft.com/office/word/2010/wordprocessingCanvas" xmlns:mc="http://schemas.openxmlformats.org/markup-compatibility/2006" xmlns:o="urn:schemas-microsoft-com:office:office" xmlns:r="http://schemas.openxmlformats.org/officeDocument/2006/relationships" xmlns:m="http://schemas.openxmlformats.org/officeDocument/2006/math" xmlns:v="urn:schemas-microsoft-com:vml" xmlns:wp14="http://schemas.microsoft.com/office/word/2010/wordprocessingDrawing" xmlns:wp="http://schemas.openxmlformats.org/drawingml/2006/wordprocessingDrawing" xmlns:w10="urn:schemas-microsoft-com:office:word" xmlns:w="http://schemas.openxmlformats.org/wordprocessingml/2006/main" xmlns:w14="http://schemas.microsoft.com/office/word/2010/wordml" xmlns:w15="http://schemas.microsoft.com/office/word/2012/wordml" xmlns:wpg="http://schemas.microsoft.com/office/word/2010/wordprocessingGroup" xmlns:wpi="http://schemas.microsoft.com/office/word/2010/wordprocessingInk" xmlns:wne="http://schemas.microsoft.com/office/word/2006/wordml" xmlns:wps="http://schemas.microsoft.com/office/word/2010/wordprocessingShape" xmlns:cx="http://schemas.microsoft.com/office/drawing/2014/chartex" xmlns:cx1="http://schemas.microsoft.com/office/drawing/2015/9/8/chartex" xmlns:cx2="http://schemas.microsoft.com/office/drawing/2015/10/21/chartex" xmlns:cx3="http://schemas.microsoft.com/office/drawing/2016/5/9/chartex" xmlns:cx4="http://schemas.microsoft.com/office/drawing/2016/5/10/chartex" xmlns:cx5="http://schemas.microsoft.com/office/drawing/2016/5/11/chartex" xmlns:cx6="http://schemas.microsoft.com/office/drawing/2016/5/12/chartex" xmlns:cx7="http://schemas.microsoft.com/office/drawing/2016/5/13/chartex" xmlns:cx8="http://schemas.microsoft.com/office/drawing/2016/5/14/chartex" xmlns:w16cid="http://schemas.microsoft.com/office/word/2016/wordml/cid" xmlns:w16se="http://schemas.microsoft.com/office/word/2015/wordml/symex">
-  <w:p>
-    <w:pPr>
-      <w:tabs>
-        <w:tab w:val="right" w:pos="9354"/>
-      </w:tabs>
-      <w:spacing w:after="40"/>
-    </w:pPr>
-    <w:r>
-      <w:rPr>
-        <w:rFonts w:ascii="Arial" w:cs="Arial" w:eastAsia="Arial" w:hAnsi="Arial"/>
-        <w:b/>
-        <w:bCs/>
-        <w:color w:val="1F3A5F"/>
-        <w:sz w:val="36"/>
-        <w:szCs w:val="36"/>
-      </w:rPr>
-      <w:t xml:space="preserve">{v_firma}</w:t>
-    </w:r>
-    <w:r>
-      <w:rPr>
-        <w:rFonts w:ascii="Arial" w:cs="Arial" w:eastAsia="Arial" w:hAnsi="Arial"/>
-        <w:color w:val="5A6270"/>
-        <w:sz w:val="16"/>
-        <w:szCs w:val="16"/>
-      </w:rPr>
-      <w:tab/>
-      <w:t xml:space="preserve">{v_strasse} · {v_plz} {v_ort}</w:t>
-    </w:r>
-  </w:p>
+  <w:tbl>
+    <w:tblPr>
+      <w:tblW w:type="dxa" w:w="9354"/>
+      <w:tblBorders>
+        <w:top w:val="none" w:color="FFFFFF" w:sz="0"/>
+        <w:left w:val="none" w:color="FFFFFF" w:sz="0"/>
+        <w:bottom w:val="none" w:color="FFFFFF" w:sz="0"/>
+        <w:right w:val="none" w:color="FFFFFF" w:sz="0"/>
+        <w:insideH w:val="none" w:color="FFFFFF" w:sz="0"/>
+        <w:insideV w:val="none" w:color="FFFFFF" w:sz="0"/>
+      </w:tblBorders>
+    </w:tblPr>
+    <w:tblGrid>
+      <w:gridCol w:w="4354"/>
+      <w:gridCol w:w="5000"/>
+    </w:tblGrid>
+    <w:tr>
+      <w:tc>
+        <w:tcPr>
+          <w:tcW w:type="dxa" w:w="4354"/>
+          <w:tcBorders>
+            <w:top w:val="none" w:color="FFFFFF" w:sz="0"/>
+            <w:left w:val="none" w:color="FFFFFF" w:sz="0"/>
+            <w:bottom w:val="none" w:color="FFFFFF" w:sz="0"/>
+            <w:right w:val="none" w:color="FFFFFF" w:sz="0"/>
+          </w:tcBorders>
+          <w:tcMar>
+            <w:top w:type="dxa" w:w="0"/>
+            <w:left w:type="dxa" w:w="0"/>
+            <w:bottom w:type="dxa" w:w="0"/>
+            <w:right w:type="dxa" w:w="0"/>
+          </w:tcMar>
+        </w:tcPr>
+        <w:p>
+          <w:pPr>
+            <w:spacing w:after="0"/>
+          </w:pPr>
+          <w:r>
+            <w:rPr>
+              <w:rFonts w:ascii="Arial" w:cs="Arial" w:eastAsia="Arial" w:hAnsi="Arial"/>
+              <w:b/>
+              <w:bCs/>
+              <w:color w:val="1F3A5F"/>
+              <w:sz w:val="36"/>
+              <w:szCs w:val="36"/>
+            </w:rPr>
+            <w:t xml:space="preserve">{v_firma}</w:t>
+          </w:r>
+        </w:p>
+        <w:p>
+          <w:pPr>
+            <w:spacing w:after="0"/>
+          </w:pPr>
+          <w:r>
+            <w:rPr>
+              <w:rFonts w:ascii="Arial" w:cs="Arial" w:eastAsia="Arial" w:hAnsi="Arial"/>
+              <w:color w:val="5A6270"/>
+              <w:spacing w:val="20"/>
+              <w:sz w:val="16"/>
+              <w:szCs w:val="16"/>
+            </w:rPr>
+            <w:t xml:space="preserve">Immobilienverwaltung</w:t>
+          </w:r>
+        </w:p>
+      </w:tc>
+      <w:tc>
+        <w:tcPr>
+          <w:tcW w:type="dxa" w:w="5000"/>
+          <w:tcBorders>
+            <w:top w:val="none" w:color="FFFFFF" w:sz="0"/>
+            <w:left w:val="none" w:color="FFFFFF" w:sz="0"/>
+            <w:bottom w:val="none" w:color="FFFFFF" w:sz="0"/>
+            <w:right w:val="none" w:color="FFFFFF" w:sz="0"/>
+          </w:tcBorders>
+          <w:tcMar>
+            <w:top w:type="dxa" w:w="0"/>
+            <w:left w:type="dxa" w:w="0"/>
+            <w:bottom w:type="dxa" w:w="0"/>
+            <w:right w:type="dxa" w:w="0"/>
+          </w:tcMar>
+        </w:tcPr>
+        <w:p>
+          <w:pPr>
+            <w:spacing w:after="0"/>
+          </w:pPr>
+          <w:r>
+            <w:rPr>
+              <w:rFonts w:ascii="Arial" w:cs="Arial" w:eastAsia="Arial" w:hAnsi="Arial"/>
+              <w:sz w:val="21"/>
+              <w:szCs w:val="21"/>
+            </w:rPr>
+            <w:t xml:space="preserve"/>
+          </w:r>
+        </w:p>
+        <w:p>
+          <w:pPr>
+            <w:spacing w:after="0"/>
+            <w:jc w:val="right"/>
+          </w:pPr>
+          <w:r>
+            <w:rPr>
+              <w:rFonts w:ascii="Arial" w:cs="Arial" w:eastAsia="Arial" w:hAnsi="Arial"/>
+              <w:color w:val="5A6270"/>
+              <w:sz w:val="16"/>
+              <w:szCs w:val="16"/>
+            </w:rPr>
+            <w:t xml:space="preserve">{v_strasse} · {v_plz} {v_ort}</w:t>
+          </w:r>
+        </w:p>
+        <w:p>
+          <w:pPr>
+            <w:spacing w:after="0"/>
+            <w:jc w:val="right"/>
+          </w:pPr>
+          <w:r>
+            <w:rPr>
+              <w:rFonts w:ascii="Arial" w:cs="Arial" w:eastAsia="Arial" w:hAnsi="Arial"/>
+              <w:color w:val="5A6270"/>
+              <w:sz w:val="16"/>
+              <w:szCs w:val="16"/>
+            </w:rPr>
+            <w:t xml:space="preserve">Tel. {v_telefon} · {v_email} · {v_web}</w:t>
+          </w:r>
+        </w:p>
+      </w:tc>
+    </w:tr>
+  </w:tbl>
   <w:p>
     <w:pPr>
       <w:pBdr>
-        <w:bottom w:val="single" w:color="B08D57" w:sz="8" w:space="4"/>
+        <w:bottom w:val="single" w:color="B08D57" w:sz="8" w:space="1"/>
       </w:pBdr>
-      <w:tabs>
-        <w:tab w:val="right" w:pos="9354"/>
-      </w:tabs>
       <w:spacing w:after="0"/>
     </w:pPr>
     <w:r>
       <w:rPr>
         <w:rFonts w:ascii="Arial" w:cs="Arial" w:eastAsia="Arial" w:hAnsi="Arial"/>
-        <w:color w:val="5A6270"/>
-        <w:spacing w:val="20"/>
-        <w:sz w:val="16"/>
-        <w:szCs w:val="16"/>
+        <w:sz w:val="4"/>
+        <w:szCs w:val="4"/>
       </w:rPr>
-      <w:t xml:space="preserve">Immobilienverwaltung</w:t>
-    </w:r>
-    <w:r>
-      <w:rPr>
-        <w:rFonts w:ascii="Arial" w:cs="Arial" w:eastAsia="Arial" w:hAnsi="Arial"/>
-        <w:color w:val="5A6270"/>
-        <w:sz w:val="16"/>
-        <w:szCs w:val="16"/>
-      </w:rPr>
-      <w:tab/>
-      <w:t xml:space="preserve">Tel. {v_telefon} · {v_email} · {v_web}</w:t>
+      <w:t xml:space="preserve"/>
     </w:r>
   </w:p>
 </w:hdr>

</xml_diff>